<commit_message>
Fix remaining Designated Safeguarding Lead / DPO hire claims
Appendix I and the merged reference doc still claimed a Month 1 DSL
hire and an in-house FTE DPO by Year 2 — both contradict the
self-funded plan, which has no hires before Year 3. Corrected to match:
founder covers the DSL role personally through Y1–Y2, and the DPO
stays fractional/outsourced throughout, with no FTE assumed in this
3-year plan. Rebuilt the affected PDF, re-merged the full submission,
and regenerated the two affected .docx files.

Co-Authored-By: Claude Sonnet 5 <noreply@anthropic.com>
</commit_message>
<xml_diff>
--- a/visa_appendices/docx/DEQUAD_UKES_FULL_SUBMISSION.docx
+++ b/visa_appendices/docx/DEQUAD_UKES_FULL_SUBMISSION.docx
@@ -31925,7 +31925,7 @@
                 <w:i/>
                 <w:iCs/>
               </w:rPr>
-              <w:t xml:space="preserve">To be appointed Month 1 post-endorsement</w:t>
+              <w:t xml:space="preserve">Yusuf Quadri, CEO, personally (a qualified safeguarding professional) through Y1–Y2; a dedicated part-time Safeguarding &amp; Trust Lead is planned for Y3, contingent on 2+ paying universities and funded entirely by revenue — see Business Plan §18.3</w:t>
             </w:r>
           </w:p>
         </w:tc>
@@ -31964,7 +31964,7 @@
                 <w:i/>
                 <w:iCs/>
               </w:rPr>
-              <w:t xml:space="preserve">Outsourced fractional in Y1 (e.g. The DPO Centre, IT Governance); FTE in Y2</w:t>
+              <w:t xml:space="preserve">Outsourced fractional throughout Y1–Y2 (e.g. The DPO Centre, low-cost pay-as-you-go); an in-house FTE DPO is not assumed in this 3-year plan and would only be considered later if data-processing scale justifies it</w:t>
             </w:r>
           </w:p>
         </w:tc>

</xml_diff>

<commit_message>
Fix last stale anchor-pilot claims in the merged reference doc
Three "anchor pilot discussion currently in progress" / "anchor pilot
relationship" claims in the embedded Founder CV section of
DEQUAD_UKES_Full_Submission.md had been missed when B_founder_cv.md
was fixed separately — same issue, different copy. Corrected to match
the rest of the plan (early, informal conversation only; nothing
signed) and regenerated the corresponding .docx.

Co-Authored-By: Claude Sonnet 5 <noreply@anthropic.com>
</commit_message>
<xml_diff>
--- a/visa_appendices/docx/DEQUAD_UKES_FULL_SUBMISSION.docx
+++ b/visa_appendices/docx/DEQUAD_UKES_FULL_SUBMISSION.docx
@@ -16733,7 +16733,7 @@
         </w:numPr>
       </w:pPr>
       <w:r>
-        <w:t xml:space="preserve">Anchor pilot discussion currently in progress with the</w:t>
+        <w:t xml:space="preserve">In early, informal conversation about a possible pilot with the</w:t>
       </w:r>
       <w:r>
         <w:t xml:space="preserve"> </w:t>
@@ -16746,7 +16746,10 @@
         <w:t xml:space="preserve">University of Bedfordshire</w:t>
       </w:r>
       <w:r>
-        <w:t xml:space="preserve">, leveraging two years’ tenure as the university’s Students’ Union President.</w:t>
+        <w:t xml:space="preserve"> </w:t>
+      </w:r>
+      <w:r>
+        <w:t xml:space="preserve">— no agreement, LOI or date is signed — leveraging two years’ tenure as the university’s Students’ Union President.</w:t>
       </w:r>
     </w:p>
     <w:p>
@@ -17201,7 +17204,7 @@
         </w:numPr>
       </w:pPr>
       <w:r>
-        <w:t xml:space="preserve">Built the direct relationships with the Director of Student Services, safeguarding leads and senior leadership that now underpin DEQUAD’s anchor pilot discussion.</w:t>
+        <w:t xml:space="preserve">Built the direct relationships with the Director of Student Services, safeguarding leads and senior leadership that now underpin DEQUAD’s early, informal pilot conversation with the university — nothing signed to date.</w:t>
       </w:r>
     </w:p>
     <w:bookmarkEnd w:id="82"/>
@@ -42261,7 +42264,7 @@
         <w:t xml:space="preserve"> </w:t>
       </w:r>
       <w:r>
-        <w:t xml:space="preserve">(two consecutive terms). Represented the student body at senior-management level on student-services, safeguarding and welfare policy. This is the basis of DEQUAD’s anchor pilot relationship with the same university.</w:t>
+        <w:t xml:space="preserve">(two consecutive terms). Represented the student body at senior-management level on student-services, safeguarding and welfare policy. This is the basis of DEQUAD’s early, informal pilot conversation with the same university — no agreement is signed.</w:t>
       </w:r>
     </w:p>
     <w:p>

</xml_diff>

<commit_message>
Regenerate PDF/DOCX exports for the recruitment-channel additions
Rebuilds all appendix PDFs and the merged DEQUAD_UKES_FULL_SUBMISSION.pdf
via build_ukes_pdf.py, and the G_job_descriptions/Full_Submission DOCX
exports via pandoc. Unrelated PDFs also show as changed because
chromium's print-to-pdf output isn't byte-stable across runs.

Co-Authored-By: Claude Sonnet 5 <noreply@anthropic.com>
</commit_message>
<xml_diff>
--- a/visa_appendices/docx/DEQUAD_UKES_FULL_SUBMISSION.docx
+++ b/visa_appendices/docx/DEQUAD_UKES_FULL_SUBMISSION.docx
@@ -29896,6 +29896,30 @@
           </w:p>
         </w:tc>
       </w:tr>
+      <w:tr>
+        <w:tc>
+          <w:tcPr/>
+          <w:p>
+            <w:pPr>
+              <w:pStyle w:val="Compact"/>
+            </w:pPr>
+            <w:r>
+              <w:t xml:space="preserve">Recruitment channel</w:t>
+            </w:r>
+          </w:p>
+        </w:tc>
+        <w:tc>
+          <w:tcPr/>
+          <w:p>
+            <w:pPr>
+              <w:pStyle w:val="Compact"/>
+            </w:pPr>
+            <w:r>
+              <w:t xml:space="preserve">University careers portals, partner-university SU/society networks, LinkedIn</w:t>
+            </w:r>
+          </w:p>
+        </w:tc>
+      </w:tr>
     </w:tbl>
     <w:bookmarkEnd w:id="159"/>
     <w:bookmarkStart w:id="160" w:name="g.3.2-social-media-manager"/>
@@ -29993,6 +30017,30 @@
           </w:p>
         </w:tc>
       </w:tr>
+      <w:tr>
+        <w:tc>
+          <w:tcPr/>
+          <w:p>
+            <w:pPr>
+              <w:pStyle w:val="Compact"/>
+            </w:pPr>
+            <w:r>
+              <w:t xml:space="preserve">Recruitment channel</w:t>
+            </w:r>
+          </w:p>
+        </w:tc>
+        <w:tc>
+          <w:tcPr/>
+          <w:p>
+            <w:pPr>
+              <w:pStyle w:val="Compact"/>
+            </w:pPr>
+            <w:r>
+              <w:t xml:space="preserve">LinkedIn, Otta, NatWest Accelerator alumni network</w:t>
+            </w:r>
+          </w:p>
+        </w:tc>
+      </w:tr>
     </w:tbl>
     <w:bookmarkEnd w:id="160"/>
     <w:bookmarkStart w:id="161" w:name="g.3.3-marketing-intern"/>
@@ -30090,6 +30138,30 @@
           </w:p>
         </w:tc>
       </w:tr>
+      <w:tr>
+        <w:tc>
+          <w:tcPr/>
+          <w:p>
+            <w:pPr>
+              <w:pStyle w:val="Compact"/>
+            </w:pPr>
+            <w:r>
+              <w:t xml:space="preserve">Recruitment channel</w:t>
+            </w:r>
+          </w:p>
+        </w:tc>
+        <w:tc>
+          <w:tcPr/>
+          <w:p>
+            <w:pPr>
+              <w:pStyle w:val="Compact"/>
+            </w:pPr>
+            <w:r>
+              <w:t xml:space="preserve">University careers portals (placements), Bright Network, LinkedIn</w:t>
+            </w:r>
+          </w:p>
+        </w:tc>
+      </w:tr>
     </w:tbl>
     <w:bookmarkEnd w:id="161"/>
     <w:bookmarkStart w:id="162" w:name="g.3.4-sales-lead"/>
@@ -30187,6 +30259,30 @@
           </w:p>
         </w:tc>
       </w:tr>
+      <w:tr>
+        <w:tc>
+          <w:tcPr/>
+          <w:p>
+            <w:pPr>
+              <w:pStyle w:val="Compact"/>
+            </w:pPr>
+            <w:r>
+              <w:t xml:space="preserve">Recruitment channel</w:t>
+            </w:r>
+          </w:p>
+        </w:tc>
+        <w:tc>
+          <w:tcPr/>
+          <w:p>
+            <w:pPr>
+              <w:pStyle w:val="Compact"/>
+            </w:pPr>
+            <w:r>
+              <w:t xml:space="preserve">Otta, LinkedIn, NatWest Accelerator alumni network</w:t>
+            </w:r>
+          </w:p>
+        </w:tc>
+      </w:tr>
     </w:tbl>
     <w:bookmarkEnd w:id="162"/>
     <w:bookmarkStart w:id="163" w:name="g.3.5-support-agent"/>
@@ -30280,6 +30376,30 @@
             </w:pPr>
             <w:r>
               <w:t xml:space="preserve">Prior customer support experience; empathetic, clear written communication; completes DEQUAD’s safeguarding awareness training within the first month</w:t>
+            </w:r>
+          </w:p>
+        </w:tc>
+      </w:tr>
+      <w:tr>
+        <w:tc>
+          <w:tcPr/>
+          <w:p>
+            <w:pPr>
+              <w:pStyle w:val="Compact"/>
+            </w:pPr>
+            <w:r>
+              <w:t xml:space="preserve">Recruitment channel</w:t>
+            </w:r>
+          </w:p>
+        </w:tc>
+        <w:tc>
+          <w:tcPr/>
+          <w:p>
+            <w:pPr>
+              <w:pStyle w:val="Compact"/>
+            </w:pPr>
+            <w:r>
+              <w:t xml:space="preserve">LinkedIn, Otta</w:t>
             </w:r>
           </w:p>
         </w:tc>

</xml_diff>

<commit_message>
Regenerate PDF/DOCX exports for the R15 fix and pen-test timing alignment
Rebuilds all appendix PDFs and the merged DEQUAD_UKES_FULL_SUBMISSION.pdf
via build_ukes_pdf.py, and the Risk Register/B_founder_cv/
J_architecture_diagram/Full Submission DOCX exports via pandoc.

Co-Authored-By: Claude Sonnet 5 <noreply@anthropic.com>
</commit_message>
<xml_diff>
--- a/visa_appendices/docx/DEQUAD_UKES_FULL_SUBMISSION.docx
+++ b/visa_appendices/docx/DEQUAD_UKES_FULL_SUBMISSION.docx
@@ -17782,7 +17782,7 @@
               <w:pStyle w:val="Compact"/>
             </w:pPr>
             <w:r>
-              <w:t xml:space="preserve">Month 6 post-endorsement</w:t>
+              <w:t xml:space="preserve">Q1 Year 2 (ahead of the Q2 Year 2 penetration test)</w:t>
             </w:r>
           </w:p>
         </w:tc>
@@ -35324,7 +35324,7 @@
               <w:pStyle w:val="Compact"/>
             </w:pPr>
             <w:r>
-              <w:t xml:space="preserve">Annual external pen-test (Y1 onward) by CREST-approved firm</w:t>
+              <w:t xml:space="preserve">Annual external pen-test (from Q2 Year 2) by CREST-approved firm</w:t>
             </w:r>
           </w:p>
         </w:tc>
@@ -39712,7 +39712,7 @@
               <w:pStyle w:val="Compact"/>
             </w:pPr>
             <w:r>
-              <w:t xml:space="preserve">Both co-founders already UK-resident; first 12 hires are UK-only; secure sponsor licence once headcount &gt; 10.</w:t>
+              <w:t xml:space="preserve">Both co-founders already UK-resident; all hires within this plan (up to 5, per the job-creation target — Appendix G) are UK-only, settled workers; a sponsor licence would only become relevant if headcount grows beyond this plan’s scope, which is not assumed here.</w:t>
             </w:r>
           </w:p>
         </w:tc>

</xml_diff>

<commit_message>
Regenerate PDF/DOCX exports for the page-count and founder-undertaking fixes
Rebuilds all appendix PDFs and the merged DEQUAD_UKES_FULL_SUBMISSION.pdf
via build_ukes_pdf.py, and the Decision Brief/Cover Email/Full
Submission DOCX exports via pandoc.

Co-Authored-By: Claude Sonnet 5 <noreply@anthropic.com>
</commit_message>
<xml_diff>
--- a/visa_appendices/docx/DEQUAD_UKES_FULL_SUBMISSION.docx
+++ b/visa_appendices/docx/DEQUAD_UKES_FULL_SUBMISSION.docx
@@ -18919,7 +18919,7 @@
         </w:numPr>
       </w:pPr>
       <w:r>
-        <w:t xml:space="preserve">accepts a £0 salary for the first six months of trading (Q1–Q2 Year 1) and a £1,500/month salary thereafter until the seed round.</w:t>
+        <w:t xml:space="preserve">accepts a £0 salary throughout Year 1 and Year 2, and a modest £500/month salary from Year 3 — funded entirely by revenue, not by any funding round.</w:t>
       </w:r>
     </w:p>
     <w:p>
@@ -40423,7 +40423,7 @@
           <w:b/>
           <w:bCs/>
         </w:rPr>
-        <w:t xml:space="preserve">15-page brief.</w:t>
+        <w:t xml:space="preserve">17-page brief.</w:t>
       </w:r>
       <w:r>
         <w:t xml:space="preserve"> </w:t>

</xml_diff>